<commit_message>
FIXED 4-DIGIT Sets of Books A bug has been fixed in the CUSTOMISE-EMPTY-BOOKS templates, resolving the Dynamic SQL Error -303. This error was caused by field length limitations in the BATTYPES database table and occurred when creating new bank accounts. The following Sets of Books were shipped with TurboCASH5-3-RELEASE-CANDIDATE-9: * 4-AF-SUID-AFRIKA-GENERIES * 4-EN-SOUTH-AFRICA-GENERIC * 4-EN-UK-GENERIC
</commit_message>
<xml_diff>
--- a/firebird-databases/NEW-COA-Create-books-advanced-CONFIGURATION.docx
+++ b/firebird-databases/NEW-COA-Create-books-advanced-CONFIGURATION.docx
@@ -1,6 +1,6 @@
 
 <file path=word/document.xml><?xml version="1.0" encoding="utf-8"?>
-<w:document xmlns:wpc="http://schemas.microsoft.com/office/word/2010/wordprocessingCanvas" xmlns:cx="http://schemas.microsoft.com/office/drawing/2014/chartex" xmlns:cx1="http://schemas.microsoft.com/office/drawing/2015/9/8/chartex" xmlns:cx2="http://schemas.microsoft.com/office/drawing/2015/10/21/chartex" xmlns:cx3="http://schemas.microsoft.com/office/drawing/2016/5/9/chartex" xmlns:cx4="http://schemas.microsoft.com/office/drawing/2016/5/10/chartex" xmlns:cx5="http://schemas.microsoft.com/office/drawing/2016/5/11/chartex" xmlns:cx6="http://schemas.microsoft.com/office/drawing/2016/5/12/chartex" xmlns:cx7="http://schemas.microsoft.com/office/drawing/2016/5/13/chartex" xmlns:cx8="http://schemas.microsoft.com/office/drawing/2016/5/14/chartex" xmlns:mc="http://schemas.openxmlformats.org/markup-compatibility/2006" xmlns:aink="http://schemas.microsoft.com/office/drawing/2016/ink" xmlns:am3d="http://schemas.microsoft.com/office/drawing/2017/model3d" xmlns:o="urn:schemas-microsoft-com:office:office" xmlns:oel="http://schemas.microsoft.com/office/2019/extlst" xmlns:r="http://schemas.openxmlformats.org/officeDocument/2006/relationships" xmlns:m="http://schemas.openxmlformats.org/officeDocument/2006/math" xmlns:v="urn:schemas-microsoft-com:vml" xmlns:wp14="http://schemas.microsoft.com/office/word/2010/wordprocessingDrawing" xmlns:wp="http://schemas.openxmlformats.org/drawingml/2006/wordprocessingDrawing" xmlns:w10="urn:schemas-microsoft-com:office:word" xmlns:w="http://schemas.openxmlformats.org/wordprocessingml/2006/main" xmlns:w14="http://schemas.microsoft.com/office/word/2010/wordml" xmlns:w15="http://schemas.microsoft.com/office/word/2012/wordml" xmlns:w16cex="http://schemas.microsoft.com/office/word/2018/wordml/cex" xmlns:w16cid="http://schemas.microsoft.com/office/word/2016/wordml/cid" xmlns:w16="http://schemas.microsoft.com/office/word/2018/wordml" xmlns:w16sdtdh="http://schemas.microsoft.com/office/word/2020/wordml/sdtdatahash" xmlns:w16se="http://schemas.microsoft.com/office/word/2015/wordml/symex" xmlns:wpg="http://schemas.microsoft.com/office/word/2010/wordprocessingGroup" xmlns:wpi="http://schemas.microsoft.com/office/word/2010/wordprocessingInk" xmlns:wne="http://schemas.microsoft.com/office/word/2006/wordml" xmlns:wps="http://schemas.microsoft.com/office/word/2010/wordprocessingShape" mc:Ignorable="w14 w15 w16se w16cid w16 w16cex w16sdtdh wp14">
+<w:document xmlns:wpc="http://schemas.microsoft.com/office/word/2010/wordprocessingCanvas" xmlns:cx="http://schemas.microsoft.com/office/drawing/2014/chartex" xmlns:cx1="http://schemas.microsoft.com/office/drawing/2015/9/8/chartex" xmlns:cx2="http://schemas.microsoft.com/office/drawing/2015/10/21/chartex" xmlns:cx3="http://schemas.microsoft.com/office/drawing/2016/5/9/chartex" xmlns:cx4="http://schemas.microsoft.com/office/drawing/2016/5/10/chartex" xmlns:cx5="http://schemas.microsoft.com/office/drawing/2016/5/11/chartex" xmlns:cx6="http://schemas.microsoft.com/office/drawing/2016/5/12/chartex" xmlns:cx7="http://schemas.microsoft.com/office/drawing/2016/5/13/chartex" xmlns:cx8="http://schemas.microsoft.com/office/drawing/2016/5/14/chartex" xmlns:mc="http://schemas.openxmlformats.org/markup-compatibility/2006" xmlns:aink="http://schemas.microsoft.com/office/drawing/2016/ink" xmlns:am3d="http://schemas.microsoft.com/office/drawing/2017/model3d" xmlns:o="urn:schemas-microsoft-com:office:office" xmlns:oel="http://schemas.microsoft.com/office/2019/extlst" xmlns:r="http://schemas.openxmlformats.org/officeDocument/2006/relationships" xmlns:m="http://schemas.openxmlformats.org/officeDocument/2006/math" xmlns:v="urn:schemas-microsoft-com:vml" xmlns:wp14="http://schemas.microsoft.com/office/word/2010/wordprocessingDrawing" xmlns:wp="http://schemas.openxmlformats.org/drawingml/2006/wordprocessingDrawing" xmlns:w10="urn:schemas-microsoft-com:office:word" xmlns:w="http://schemas.openxmlformats.org/wordprocessingml/2006/main" xmlns:w14="http://schemas.microsoft.com/office/word/2010/wordml" xmlns:w15="http://schemas.microsoft.com/office/word/2012/wordml" xmlns:w16cex="http://schemas.microsoft.com/office/word/2018/wordml/cex" xmlns:w16cid="http://schemas.microsoft.com/office/word/2016/wordml/cid" xmlns:w16="http://schemas.microsoft.com/office/word/2018/wordml" xmlns:w16du="http://schemas.microsoft.com/office/word/2023/wordml/word16du" xmlns:w16sdtdh="http://schemas.microsoft.com/office/word/2020/wordml/sdtdatahash" xmlns:w16sdtfl="http://schemas.microsoft.com/office/word/2024/wordml/sdtformatlock" xmlns:w16se="http://schemas.microsoft.com/office/word/2015/wordml/symex" xmlns:wpg="http://schemas.microsoft.com/office/word/2010/wordprocessingGroup" xmlns:wpi="http://schemas.microsoft.com/office/word/2010/wordprocessingInk" xmlns:wne="http://schemas.microsoft.com/office/word/2006/wordml" xmlns:wps="http://schemas.microsoft.com/office/word/2010/wordprocessingShape" mc:Ignorable="w14 w15 w16se w16cid w16 w16cex w16sdtdh w16sdtfl w16du wp14">
   <w:body>
     <w:sdt>
       <w:sdtPr>
@@ -11935,18 +11935,25 @@
           <w:szCs w:val="20"/>
           <w:lang w:val="x-none"/>
         </w:rPr>
-        <w:t xml:space="preserve"> - You may select your language and country in </w:t>
-      </w:r>
-      <w:r>
-        <w:rPr>
-          <w:rFonts w:ascii="Segoe UI" w:hAnsi="Segoe UI" w:cs="Segoe UI"/>
-          <w:b/>
-          <w:bCs/>
-          <w:sz w:val="20"/>
-          <w:szCs w:val="20"/>
-          <w:lang w:val="x-none"/>
-        </w:rPr>
-        <w:t xml:space="preserve">Setup → </w:t>
+        <w:t xml:space="preserve"> - You may select your language and country</w:t>
+      </w:r>
+      <w:r>
+        <w:rPr>
+          <w:rFonts w:ascii="Segoe UI" w:hAnsi="Segoe UI" w:cs="Segoe UI"/>
+          <w:sz w:val="20"/>
+          <w:szCs w:val="20"/>
+          <w:lang w:val="x-none"/>
+        </w:rPr>
+        <w:t xml:space="preserve"> </w:t>
+      </w:r>
+      <w:r>
+        <w:rPr>
+          <w:rFonts w:ascii="Segoe UI" w:hAnsi="Segoe UI" w:cs="Segoe UI"/>
+          <w:sz w:val="20"/>
+          <w:szCs w:val="20"/>
+          <w:lang w:val="x-none"/>
+        </w:rPr>
+        <w:t xml:space="preserve">in </w:t>
       </w:r>
       <w:r>
         <w:rPr>
@@ -11959,16 +11966,54 @@
           <w:u w:val="single"/>
           <w:lang w:val="x-none"/>
         </w:rPr>
-        <w:t>Access control</w:t>
-      </w:r>
-      <w:r>
-        <w:rPr>
-          <w:rFonts w:ascii="Segoe UI" w:hAnsi="Segoe UI" w:cs="Segoe UI"/>
-          <w:sz w:val="20"/>
-          <w:szCs w:val="20"/>
-          <w:lang w:val="x-none"/>
-        </w:rPr>
-        <w:t xml:space="preserve">. When reopening your Set of Books, the language will be displayed in the </w:t>
+        <w:t>Switch language</w:t>
+      </w:r>
+      <w:r>
+        <w:rPr>
+          <w:rFonts w:ascii="Segoe UI" w:hAnsi="Segoe UI" w:cs="Segoe UI"/>
+          <w:sz w:val="20"/>
+          <w:szCs w:val="20"/>
+          <w:lang w:val="x-none"/>
+        </w:rPr>
+        <w:t xml:space="preserve"> (</w:t>
+      </w:r>
+      <w:r>
+        <w:rPr>
+          <w:rFonts w:ascii="Segoe UI" w:hAnsi="Segoe UI" w:cs="Segoe UI"/>
+          <w:b/>
+          <w:bCs/>
+          <w:sz w:val="20"/>
+          <w:szCs w:val="20"/>
+          <w:lang w:val="x-none"/>
+        </w:rPr>
+        <w:t>Start</w:t>
+      </w:r>
+      <w:r>
+        <w:rPr>
+          <w:rFonts w:ascii="Segoe UI" w:hAnsi="Segoe UI" w:cs="Segoe UI"/>
+          <w:sz w:val="20"/>
+          <w:szCs w:val="20"/>
+          <w:lang w:val="x-none"/>
+        </w:rPr>
+        <w:t xml:space="preserve"> ribbon).</w:t>
+      </w:r>
+      <w:r>
+        <w:rPr>
+          <w:rFonts w:ascii="Segoe UI" w:hAnsi="Segoe UI" w:cs="Segoe UI"/>
+          <w:sz w:val="20"/>
+          <w:szCs w:val="20"/>
+          <w:lang w:val="x-none"/>
+        </w:rPr>
+        <w:t xml:space="preserve"> Y</w:t>
+      </w:r>
+      <w:r>
+        <w:rPr>
+          <w:rFonts w:ascii="Segoe UI" w:hAnsi="Segoe UI" w:cs="Segoe UI"/>
+          <w:sz w:val="20"/>
+          <w:szCs w:val="20"/>
+          <w:lang w:val="x-none"/>
+        </w:rPr>
+        <w:t xml:space="preserve">our Set of Books, the language will be displayed in the </w:t>
       </w:r>
       <w:proofErr w:type="spellStart"/>
       <w:r>
@@ -18910,7 +18955,7 @@
 </file>
 
 <file path=word/numbering.xml><?xml version="1.0" encoding="utf-8"?>
-<w:numbering xmlns:wpc="http://schemas.microsoft.com/office/word/2010/wordprocessingCanvas" xmlns:cx="http://schemas.microsoft.com/office/drawing/2014/chartex" xmlns:cx1="http://schemas.microsoft.com/office/drawing/2015/9/8/chartex" xmlns:cx2="http://schemas.microsoft.com/office/drawing/2015/10/21/chartex" xmlns:cx3="http://schemas.microsoft.com/office/drawing/2016/5/9/chartex" xmlns:cx4="http://schemas.microsoft.com/office/drawing/2016/5/10/chartex" xmlns:cx5="http://schemas.microsoft.com/office/drawing/2016/5/11/chartex" xmlns:cx6="http://schemas.microsoft.com/office/drawing/2016/5/12/chartex" xmlns:cx7="http://schemas.microsoft.com/office/drawing/2016/5/13/chartex" xmlns:cx8="http://schemas.microsoft.com/office/drawing/2016/5/14/chartex" xmlns:mc="http://schemas.openxmlformats.org/markup-compatibility/2006" xmlns:aink="http://schemas.microsoft.com/office/drawing/2016/ink" xmlns:am3d="http://schemas.microsoft.com/office/drawing/2017/model3d" xmlns:o="urn:schemas-microsoft-com:office:office" xmlns:oel="http://schemas.microsoft.com/office/2019/extlst" xmlns:r="http://schemas.openxmlformats.org/officeDocument/2006/relationships" xmlns:m="http://schemas.openxmlformats.org/officeDocument/2006/math" xmlns:v="urn:schemas-microsoft-com:vml" xmlns:wp14="http://schemas.microsoft.com/office/word/2010/wordprocessingDrawing" xmlns:wp="http://schemas.openxmlformats.org/drawingml/2006/wordprocessingDrawing" xmlns:w10="urn:schemas-microsoft-com:office:word" xmlns:w="http://schemas.openxmlformats.org/wordprocessingml/2006/main" xmlns:w14="http://schemas.microsoft.com/office/word/2010/wordml" xmlns:w15="http://schemas.microsoft.com/office/word/2012/wordml" xmlns:w16cex="http://schemas.microsoft.com/office/word/2018/wordml/cex" xmlns:w16cid="http://schemas.microsoft.com/office/word/2016/wordml/cid" xmlns:w16="http://schemas.microsoft.com/office/word/2018/wordml" xmlns:w16sdtdh="http://schemas.microsoft.com/office/word/2020/wordml/sdtdatahash" xmlns:w16se="http://schemas.microsoft.com/office/word/2015/wordml/symex" xmlns:wpg="http://schemas.microsoft.com/office/word/2010/wordprocessingGroup" xmlns:wpi="http://schemas.microsoft.com/office/word/2010/wordprocessingInk" xmlns:wne="http://schemas.microsoft.com/office/word/2006/wordml" xmlns:wps="http://schemas.microsoft.com/office/word/2010/wordprocessingShape" mc:Ignorable="w14 w15 w16se w16cid w16 w16cex w16sdtdh wp14">
+<w:numbering xmlns:wpc="http://schemas.microsoft.com/office/word/2010/wordprocessingCanvas" xmlns:cx="http://schemas.microsoft.com/office/drawing/2014/chartex" xmlns:cx1="http://schemas.microsoft.com/office/drawing/2015/9/8/chartex" xmlns:cx2="http://schemas.microsoft.com/office/drawing/2015/10/21/chartex" xmlns:cx3="http://schemas.microsoft.com/office/drawing/2016/5/9/chartex" xmlns:cx4="http://schemas.microsoft.com/office/drawing/2016/5/10/chartex" xmlns:cx5="http://schemas.microsoft.com/office/drawing/2016/5/11/chartex" xmlns:cx6="http://schemas.microsoft.com/office/drawing/2016/5/12/chartex" xmlns:cx7="http://schemas.microsoft.com/office/drawing/2016/5/13/chartex" xmlns:cx8="http://schemas.microsoft.com/office/drawing/2016/5/14/chartex" xmlns:mc="http://schemas.openxmlformats.org/markup-compatibility/2006" xmlns:aink="http://schemas.microsoft.com/office/drawing/2016/ink" xmlns:am3d="http://schemas.microsoft.com/office/drawing/2017/model3d" xmlns:o="urn:schemas-microsoft-com:office:office" xmlns:oel="http://schemas.microsoft.com/office/2019/extlst" xmlns:r="http://schemas.openxmlformats.org/officeDocument/2006/relationships" xmlns:m="http://schemas.openxmlformats.org/officeDocument/2006/math" xmlns:v="urn:schemas-microsoft-com:vml" xmlns:wp14="http://schemas.microsoft.com/office/word/2010/wordprocessingDrawing" xmlns:wp="http://schemas.openxmlformats.org/drawingml/2006/wordprocessingDrawing" xmlns:w10="urn:schemas-microsoft-com:office:word" xmlns:w="http://schemas.openxmlformats.org/wordprocessingml/2006/main" xmlns:w14="http://schemas.microsoft.com/office/word/2010/wordml" xmlns:w15="http://schemas.microsoft.com/office/word/2012/wordml" xmlns:w16cex="http://schemas.microsoft.com/office/word/2018/wordml/cex" xmlns:w16cid="http://schemas.microsoft.com/office/word/2016/wordml/cid" xmlns:w16="http://schemas.microsoft.com/office/word/2018/wordml" xmlns:w16du="http://schemas.microsoft.com/office/word/2023/wordml/word16du" xmlns:w16sdtdh="http://schemas.microsoft.com/office/word/2020/wordml/sdtdatahash" xmlns:w16sdtfl="http://schemas.microsoft.com/office/word/2024/wordml/sdtformatlock" xmlns:w16se="http://schemas.microsoft.com/office/word/2015/wordml/symex" xmlns:wpg="http://schemas.microsoft.com/office/word/2010/wordprocessingGroup" xmlns:wpi="http://schemas.microsoft.com/office/word/2010/wordprocessingInk" xmlns:wne="http://schemas.microsoft.com/office/word/2006/wordml" xmlns:wps="http://schemas.microsoft.com/office/word/2010/wordprocessingShape" mc:Ignorable="w14 w15 w16se w16cid w16 w16cex w16sdtdh w16sdtfl w16du wp14">
   <w:abstractNum w:abstractNumId="0" w15:restartNumberingAfterBreak="0">
     <w:nsid w:val="103A3C00"/>
     <w:multiLevelType w:val="hybridMultilevel"/>
@@ -21525,7 +21570,7 @@
 </file>
 
 <file path=word/styles.xml><?xml version="1.0" encoding="utf-8"?>
-<w:styles xmlns:mc="http://schemas.openxmlformats.org/markup-compatibility/2006" xmlns:r="http://schemas.openxmlformats.org/officeDocument/2006/relationships" xmlns:w="http://schemas.openxmlformats.org/wordprocessingml/2006/main" xmlns:w14="http://schemas.microsoft.com/office/word/2010/wordml" xmlns:w15="http://schemas.microsoft.com/office/word/2012/wordml" xmlns:w16cex="http://schemas.microsoft.com/office/word/2018/wordml/cex" xmlns:w16cid="http://schemas.microsoft.com/office/word/2016/wordml/cid" xmlns:w16="http://schemas.microsoft.com/office/word/2018/wordml" xmlns:w16sdtdh="http://schemas.microsoft.com/office/word/2020/wordml/sdtdatahash" xmlns:w16se="http://schemas.microsoft.com/office/word/2015/wordml/symex" mc:Ignorable="w14 w15 w16se w16cid w16 w16cex w16sdtdh">
+<w:styles xmlns:mc="http://schemas.openxmlformats.org/markup-compatibility/2006" xmlns:r="http://schemas.openxmlformats.org/officeDocument/2006/relationships" xmlns:w="http://schemas.openxmlformats.org/wordprocessingml/2006/main" xmlns:w14="http://schemas.microsoft.com/office/word/2010/wordml" xmlns:w15="http://schemas.microsoft.com/office/word/2012/wordml" xmlns:w16cex="http://schemas.microsoft.com/office/word/2018/wordml/cex" xmlns:w16cid="http://schemas.microsoft.com/office/word/2016/wordml/cid" xmlns:w16="http://schemas.microsoft.com/office/word/2018/wordml" xmlns:w16du="http://schemas.microsoft.com/office/word/2023/wordml/word16du" xmlns:w16sdtdh="http://schemas.microsoft.com/office/word/2020/wordml/sdtdatahash" xmlns:w16sdtfl="http://schemas.microsoft.com/office/word/2024/wordml/sdtformatlock" xmlns:w16se="http://schemas.microsoft.com/office/word/2015/wordml/symex" mc:Ignorable="w14 w15 w16se w16cid w16 w16cex w16sdtdh w16sdtfl w16du">
   <w:docDefaults>
     <w:rPrDefault>
       <w:rPr>

</xml_diff>